<commit_message>
Further efforts to make pinning better on mobile. Also trial of arrow indicator.
</commit_message>
<xml_diff>
--- a/input/stepped-table-test/stepped-table-test.docx
+++ b/input/stepped-table-test/stepped-table-test.docx
@@ -280,9 +280,10 @@
         <w:t xml:space="preserve"> Once this text is all gone, we’ll have to go into another section to reset things. Let’s see how it all comes out!</w:t>
       </w:r>
     </w:p>
+    <w:p/>
     <w:p>
       <w:pPr>
-        <w:pStyle w:val="Heading1"/>
+        <w:pStyle w:val="wiper"/>
       </w:pPr>
       <w:r>
         <w:t>Another section</w:t>
@@ -291,6 +292,20 @@
     <w:p>
       <w:r>
         <w:t>And we’re done.</w:t>
+      </w:r>
+    </w:p>
+    <w:p/>
+    <w:p>
+      <w:pPr>
+        <w:pStyle w:val="Heading1"/>
+      </w:pPr>
+      <w:r>
+        <w:t>And another</w:t>
+      </w:r>
+    </w:p>
+    <w:p>
+      <w:r>
+        <w:t>And this one will hopefully wipe up over the previous on.</w:t>
       </w:r>
     </w:p>
     <w:sectPr>
@@ -1355,6 +1370,12 @@
     <w:qFormat/>
     <w:rsid w:val="00496363"/>
   </w:style>
+  <w:style w:type="paragraph" w:customStyle="1" w:styleId="wiper">
+    <w:name w:val="wiper"/>
+    <w:basedOn w:val="Heading1"/>
+    <w:qFormat/>
+    <w:rsid w:val="0047336A"/>
+  </w:style>
 </w:styles>
 </file>
 

</xml_diff>